<commit_message>
Update Hero section and CV document
</commit_message>
<xml_diff>
--- a/public/Javaria_Shabbir_CV.docx
+++ b/public/Javaria_Shabbir_CV.docx
@@ -597,7 +597,7 @@
           <w:sz w:val="20"/>
           <w:szCs w:val="20"/>
         </w:rPr>
-        <w:t>Mern</w:t>
+        <w:t>full stack (</w:t>
       </w:r>
       <w:r>
         <w:rPr>
@@ -607,7 +607,37 @@
           <w:sz w:val="20"/>
           <w:szCs w:val="20"/>
         </w:rPr>
-        <w:t>-stack web development</w:t>
+        <w:t>Mern</w:t>
+      </w:r>
+      <w:r>
+        <w:rPr>
+          <w:rFonts w:asciiTheme="majorBidi" w:hAnsiTheme="majorBidi" w:cstheme="majorBidi"/>
+          <w:b/>
+          <w:bCs/>
+          <w:sz w:val="20"/>
+          <w:szCs w:val="20"/>
+        </w:rPr>
+        <w:t>-stack</w:t>
+      </w:r>
+      <w:r>
+        <w:rPr>
+          <w:rFonts w:asciiTheme="majorBidi" w:hAnsiTheme="majorBidi" w:cstheme="majorBidi"/>
+          <w:b/>
+          <w:bCs/>
+          <w:sz w:val="20"/>
+          <w:szCs w:val="20"/>
+        </w:rPr>
+        <w:t>)</w:t>
+      </w:r>
+      <w:r>
+        <w:rPr>
+          <w:rFonts w:asciiTheme="majorBidi" w:hAnsiTheme="majorBidi" w:cstheme="majorBidi"/>
+          <w:b/>
+          <w:bCs/>
+          <w:sz w:val="20"/>
+          <w:szCs w:val="20"/>
+        </w:rPr>
+        <w:t xml:space="preserve"> web development</w:t>
       </w:r>
       <w:r>
         <w:rPr>

</xml_diff>